<commit_message>
AI A3: Optimized Performance
</commit_message>
<xml_diff>
--- a/Semester-6/AI/Assignment 3/Assignment3_Report.docx
+++ b/Semester-6/AI/Assignment 3/Assignment3_Report.docx
@@ -502,17 +502,7 @@
           <w:sz w:val="32"/>
           <w:szCs w:val="32"/>
         </w:rPr>
-        <w:t>April</w:t>
-      </w:r>
-      <w:r>
-        <w:rPr>
-          <w:rFonts w:ascii="Calisto MT" w:eastAsia="Calisto MT" w:hAnsi="Calisto MT" w:cs="Calisto MT"/>
-          <w:b/>
-          <w:bCs/>
-          <w:sz w:val="32"/>
-          <w:szCs w:val="32"/>
-        </w:rPr>
-        <w:t>,</w:t>
+        <w:t>April,</w:t>
       </w:r>
       <w:proofErr w:type="gramEnd"/>
       <w:r>
@@ -2881,21 +2871,7 @@
         <w:rPr>
           <w:rFonts w:ascii="Calisto MT" w:hAnsi="Calisto MT"/>
         </w:rPr>
-        <w:t xml:space="preserve"> {EMPTY, OBSTACLE, FORTRESS, MINEFIELD, </w:t>
-      </w:r>
-      <w:proofErr w:type="gramStart"/>
-      <w:r>
-        <w:rPr>
-          <w:rFonts w:ascii="Calisto MT" w:hAnsi="Calisto MT"/>
-        </w:rPr>
-        <w:t>OWNED},</w:t>
-      </w:r>
-      <w:proofErr w:type="gramEnd"/>
-      <w:r>
-        <w:rPr>
-          <w:rFonts w:ascii="Calisto MT" w:hAnsi="Calisto MT"/>
-        </w:rPr>
-        <w:t xml:space="preserve"> owner </w:t>
+        <w:t xml:space="preserve"> {EMPTY, OBSTACLE, FORTRESS, MINEFIELD, OWNED}, owner </w:t>
       </w:r>
       <w:r>
         <w:rPr>
@@ -3051,21 +3027,7 @@
         <w:rPr>
           <w:rFonts w:ascii="Calisto MT" w:hAnsi="Calisto MT"/>
         </w:rPr>
-        <w:t xml:space="preserve"> </w:t>
-      </w:r>
-      <w:proofErr w:type="gramStart"/>
-      <w:r>
-        <w:rPr>
-          <w:rFonts w:ascii="Calisto MT" w:hAnsi="Calisto MT"/>
-        </w:rPr>
-        <w:t>holds:</w:t>
-      </w:r>
-      <w:proofErr w:type="gramEnd"/>
-      <w:r>
-        <w:rPr>
-          <w:rFonts w:ascii="Calisto MT" w:hAnsi="Calisto MT"/>
-        </w:rPr>
-        <w:t xml:space="preserve"> energy (0</w:t>
+        <w:t xml:space="preserve"> holds: energy (0</w:t>
       </w:r>
       <w:r>
         <w:rPr>
@@ -3193,21 +3155,7 @@
         <w:rPr>
           <w:rFonts w:ascii="Calisto MT" w:hAnsi="Calisto MT"/>
         </w:rPr>
-        <w:t xml:space="preserve">The search tree alternates between three node types per </w:t>
-      </w:r>
-      <w:proofErr w:type="gramStart"/>
-      <w:r>
-        <w:rPr>
-          <w:rFonts w:ascii="Calisto MT" w:hAnsi="Calisto MT"/>
-        </w:rPr>
-        <w:t>ply</w:t>
-      </w:r>
-      <w:proofErr w:type="gramEnd"/>
-      <w:r>
-        <w:rPr>
-          <w:rFonts w:ascii="Calisto MT" w:hAnsi="Calisto MT"/>
-        </w:rPr>
-        <w:t>:</w:t>
+        <w:t>The search tree alternates between three node types per ply:</w:t>
       </w:r>
     </w:p>
     <w:p>
@@ -3234,9 +3182,17 @@
           <w:sz w:val="18"/>
           <w:szCs w:val="18"/>
         </w:rPr>
-        <w:t xml:space="preserve">MAX </w:t>
-      </w:r>
-      <w:proofErr w:type="gramStart"/>
+        <w:t xml:space="preserve">MAX node  (root agent's turn) </w:t>
+      </w:r>
+      <w:r>
+        <w:rPr>
+          <w:rFonts w:ascii="Times New Roman" w:eastAsia="Courier New" w:hAnsi="Times New Roman" w:cs="Times New Roman"/>
+          <w:color w:val="222222"/>
+          <w:sz w:val="18"/>
+          <w:szCs w:val="18"/>
+        </w:rPr>
+        <w:t>─</w:t>
+      </w:r>
       <w:r>
         <w:rPr>
           <w:rFonts w:ascii="Calisto MT" w:eastAsia="Courier New" w:hAnsi="Calisto MT" w:cs="Courier New"/>
@@ -3244,9 +3200,18 @@
           <w:sz w:val="18"/>
           <w:szCs w:val="18"/>
         </w:rPr>
-        <w:t>node  (</w:t>
-      </w:r>
-      <w:proofErr w:type="gramEnd"/>
+        <w:t xml:space="preserve"> Alpha-Beta pruning applied</w:t>
+      </w:r>
+    </w:p>
+    <w:p>
+      <w:pPr>
+        <w:shd w:val="clear" w:color="auto" w:fill="F2F2F2"/>
+        <w:spacing w:after="60"/>
+        <w:ind w:left="400"/>
+        <w:rPr>
+          <w:rFonts w:ascii="Calisto MT" w:hAnsi="Calisto MT"/>
+        </w:rPr>
+      </w:pPr>
       <w:r>
         <w:rPr>
           <w:rFonts w:ascii="Calisto MT" w:eastAsia="Courier New" w:hAnsi="Calisto MT" w:cs="Courier New"/>
@@ -3254,7 +3219,43 @@
           <w:sz w:val="18"/>
           <w:szCs w:val="18"/>
         </w:rPr>
-        <w:t xml:space="preserve">root agent's turn) </w:t>
+        <w:t xml:space="preserve">  </w:t>
+      </w:r>
+      <w:r>
+        <w:rPr>
+          <w:rFonts w:ascii="MS Mincho" w:eastAsia="MS Mincho" w:hAnsi="MS Mincho" w:cs="MS Mincho" w:hint="eastAsia"/>
+          <w:color w:val="222222"/>
+          <w:sz w:val="18"/>
+          <w:szCs w:val="18"/>
+        </w:rPr>
+        <w:t>└──</w:t>
+      </w:r>
+      <w:r>
+        <w:rPr>
+          <w:rFonts w:ascii="Calisto MT" w:eastAsia="Courier New" w:hAnsi="Calisto MT" w:cs="Courier New"/>
+          <w:color w:val="222222"/>
+          <w:sz w:val="18"/>
+          <w:szCs w:val="18"/>
+        </w:rPr>
+        <w:t xml:space="preserve"> CHANCE node (9</w:t>
+      </w:r>
+      <w:r>
+        <w:rPr>
+          <w:rFonts w:ascii="Calisto MT" w:eastAsia="Courier New" w:hAnsi="Calisto MT" w:cs="Courier New"/>
+          <w:color w:val="222222"/>
+          <w:sz w:val="18"/>
+          <w:szCs w:val="18"/>
+        </w:rPr>
+        <w:t>-</w:t>
+      </w:r>
+      <w:r>
+        <w:rPr>
+          <w:rFonts w:ascii="Calisto MT" w:eastAsia="Courier New" w:hAnsi="Calisto MT" w:cs="Courier New"/>
+          <w:color w:val="222222"/>
+          <w:sz w:val="18"/>
+          <w:szCs w:val="18"/>
+        </w:rPr>
+        <w:t xml:space="preserve">sided die; 6 collapsed outcome tags) </w:t>
       </w:r>
       <w:r>
         <w:rPr>
@@ -3272,7 +3273,7 @@
           <w:sz w:val="18"/>
           <w:szCs w:val="18"/>
         </w:rPr>
-        <w:t xml:space="preserve"> Alpha-Beta pruning applied</w:t>
+        <w:t xml:space="preserve"> no pruning</w:t>
       </w:r>
     </w:p>
     <w:p>
@@ -3291,7 +3292,7 @@
           <w:sz w:val="18"/>
           <w:szCs w:val="18"/>
         </w:rPr>
-        <w:t xml:space="preserve">  </w:t>
+        <w:t xml:space="preserve">        </w:t>
       </w:r>
       <w:r>
         <w:rPr>
@@ -3300,7 +3301,7 @@
           <w:sz w:val="18"/>
           <w:szCs w:val="18"/>
         </w:rPr>
-        <w:t>└──</w:t>
+        <w:t>├──</w:t>
       </w:r>
       <w:r>
         <w:rPr>
@@ -3309,7 +3310,16 @@
           <w:sz w:val="18"/>
           <w:szCs w:val="18"/>
         </w:rPr>
-        <w:t xml:space="preserve"> CHANCE node (9</w:t>
+        <w:t xml:space="preserve"> [p=0.35] fail outcomes  </w:t>
+      </w:r>
+      <w:r>
+        <w:rPr>
+          <w:rFonts w:ascii="Times New Roman" w:eastAsia="Courier New" w:hAnsi="Times New Roman" w:cs="Times New Roman"/>
+          <w:color w:val="222222"/>
+          <w:sz w:val="18"/>
+          <w:szCs w:val="18"/>
+        </w:rPr>
+        <w:t>→</w:t>
       </w:r>
       <w:r>
         <w:rPr>
@@ -3318,8 +3328,18 @@
           <w:sz w:val="18"/>
           <w:szCs w:val="18"/>
         </w:rPr>
-        <w:t>-</w:t>
-      </w:r>
+        <w:t xml:space="preserve">  MIN node (opponent turn)</w:t>
+      </w:r>
+    </w:p>
+    <w:p>
+      <w:pPr>
+        <w:shd w:val="clear" w:color="auto" w:fill="F2F2F2"/>
+        <w:spacing w:after="60"/>
+        <w:ind w:left="400"/>
+        <w:rPr>
+          <w:rFonts w:ascii="Calisto MT" w:hAnsi="Calisto MT"/>
+        </w:rPr>
+      </w:pPr>
       <w:r>
         <w:rPr>
           <w:rFonts w:ascii="Calisto MT" w:eastAsia="Courier New" w:hAnsi="Calisto MT" w:cs="Courier New"/>
@@ -3327,7 +3347,43 @@
           <w:sz w:val="18"/>
           <w:szCs w:val="18"/>
         </w:rPr>
-        <w:t xml:space="preserve">sided die; 6 collapsed outcome tags) </w:t>
+        <w:t xml:space="preserve">        </w:t>
+      </w:r>
+      <w:r>
+        <w:rPr>
+          <w:rFonts w:ascii="MS Mincho" w:eastAsia="MS Mincho" w:hAnsi="MS Mincho" w:cs="MS Mincho" w:hint="eastAsia"/>
+          <w:color w:val="222222"/>
+          <w:sz w:val="18"/>
+          <w:szCs w:val="18"/>
+        </w:rPr>
+        <w:t>│</w:t>
+      </w:r>
+      <w:r>
+        <w:rPr>
+          <w:rFonts w:ascii="Calisto MT" w:eastAsia="Courier New" w:hAnsi="Calisto MT" w:cs="Courier New"/>
+          <w:color w:val="222222"/>
+          <w:sz w:val="18"/>
+          <w:szCs w:val="18"/>
+        </w:rPr>
+        <w:t xml:space="preserve">     </w:t>
+      </w:r>
+      <w:r>
+        <w:rPr>
+          <w:rFonts w:ascii="MS Mincho" w:eastAsia="MS Mincho" w:hAnsi="MS Mincho" w:cs="MS Mincho" w:hint="eastAsia"/>
+          <w:color w:val="222222"/>
+          <w:sz w:val="18"/>
+          <w:szCs w:val="18"/>
+        </w:rPr>
+        <w:t>└──</w:t>
+      </w:r>
+      <w:r>
+        <w:rPr>
+          <w:rFonts w:ascii="Calisto MT" w:eastAsia="Courier New" w:hAnsi="Calisto MT" w:cs="Courier New"/>
+          <w:color w:val="222222"/>
+          <w:sz w:val="18"/>
+          <w:szCs w:val="18"/>
+        </w:rPr>
+        <w:t xml:space="preserve"> CHANCE node  </w:t>
       </w:r>
       <w:r>
         <w:rPr>
@@ -3336,7 +3392,7 @@
           <w:sz w:val="18"/>
           <w:szCs w:val="18"/>
         </w:rPr>
-        <w:t>─</w:t>
+        <w:t>→</w:t>
       </w:r>
       <w:r>
         <w:rPr>
@@ -3345,7 +3401,7 @@
           <w:sz w:val="18"/>
           <w:szCs w:val="18"/>
         </w:rPr>
-        <w:t xml:space="preserve"> no pruning</w:t>
+        <w:t xml:space="preserve">  next MIN / recurse</w:t>
       </w:r>
     </w:p>
     <w:p>
@@ -3382,9 +3438,17 @@
           <w:sz w:val="18"/>
           <w:szCs w:val="18"/>
         </w:rPr>
-        <w:t xml:space="preserve"> [p=0.35] fail </w:t>
-      </w:r>
-      <w:proofErr w:type="gramStart"/>
+        <w:t xml:space="preserve"> [p=0.28] partial outcomes  </w:t>
+      </w:r>
+      <w:r>
+        <w:rPr>
+          <w:rFonts w:ascii="Times New Roman" w:eastAsia="Courier New" w:hAnsi="Times New Roman" w:cs="Times New Roman"/>
+          <w:color w:val="222222"/>
+          <w:sz w:val="18"/>
+          <w:szCs w:val="18"/>
+        </w:rPr>
+        <w:t>→</w:t>
+      </w:r>
       <w:r>
         <w:rPr>
           <w:rFonts w:ascii="Calisto MT" w:eastAsia="Courier New" w:hAnsi="Calisto MT" w:cs="Courier New"/>
@@ -3392,7 +3456,44 @@
           <w:sz w:val="18"/>
           <w:szCs w:val="18"/>
         </w:rPr>
-        <w:t xml:space="preserve">outcomes  </w:t>
+        <w:t xml:space="preserve">  ...</w:t>
+      </w:r>
+    </w:p>
+    <w:p>
+      <w:pPr>
+        <w:shd w:val="clear" w:color="auto" w:fill="F2F2F2"/>
+        <w:spacing w:after="60"/>
+        <w:ind w:left="400"/>
+        <w:rPr>
+          <w:rFonts w:ascii="Calisto MT" w:hAnsi="Calisto MT"/>
+        </w:rPr>
+      </w:pPr>
+      <w:r>
+        <w:rPr>
+          <w:rFonts w:ascii="Calisto MT" w:eastAsia="Courier New" w:hAnsi="Calisto MT" w:cs="Courier New"/>
+          <w:color w:val="222222"/>
+          <w:sz w:val="18"/>
+          <w:szCs w:val="18"/>
+        </w:rPr>
+        <w:t xml:space="preserve">        </w:t>
+      </w:r>
+      <w:r>
+        <w:rPr>
+          <w:rFonts w:ascii="MS Mincho" w:eastAsia="MS Mincho" w:hAnsi="MS Mincho" w:cs="MS Mincho" w:hint="eastAsia"/>
+          <w:color w:val="222222"/>
+          <w:sz w:val="18"/>
+          <w:szCs w:val="18"/>
+        </w:rPr>
+        <w:t>└──</w:t>
+      </w:r>
+      <w:r>
+        <w:rPr>
+          <w:rFonts w:ascii="Calisto MT" w:eastAsia="Courier New" w:hAnsi="Calisto MT" w:cs="Courier New"/>
+          <w:color w:val="222222"/>
+          <w:sz w:val="18"/>
+          <w:szCs w:val="18"/>
+        </w:rPr>
+        <w:t xml:space="preserve"> [p=0.37] full / critical   </w:t>
       </w:r>
       <w:r>
         <w:rPr>
@@ -3403,7 +3504,6 @@
         </w:rPr>
         <w:t>→</w:t>
       </w:r>
-      <w:proofErr w:type="gramEnd"/>
       <w:r>
         <w:rPr>
           <w:rFonts w:ascii="Calisto MT" w:eastAsia="Courier New" w:hAnsi="Calisto MT" w:cs="Courier New"/>
@@ -3411,215 +3511,8 @@
           <w:sz w:val="18"/>
           <w:szCs w:val="18"/>
         </w:rPr>
-        <w:t xml:space="preserve">  MIN node (opponent turn)</w:t>
-      </w:r>
-    </w:p>
-    <w:p>
-      <w:pPr>
-        <w:shd w:val="clear" w:color="auto" w:fill="F2F2F2"/>
-        <w:spacing w:after="60"/>
-        <w:ind w:left="400"/>
-        <w:rPr>
-          <w:rFonts w:ascii="Calisto MT" w:hAnsi="Calisto MT"/>
-        </w:rPr>
-      </w:pPr>
-      <w:r>
-        <w:rPr>
-          <w:rFonts w:ascii="Calisto MT" w:eastAsia="Courier New" w:hAnsi="Calisto MT" w:cs="Courier New"/>
-          <w:color w:val="222222"/>
-          <w:sz w:val="18"/>
-          <w:szCs w:val="18"/>
-        </w:rPr>
-        <w:t xml:space="preserve">        </w:t>
-      </w:r>
-      <w:r>
-        <w:rPr>
-          <w:rFonts w:ascii="MS Mincho" w:eastAsia="MS Mincho" w:hAnsi="MS Mincho" w:cs="MS Mincho" w:hint="eastAsia"/>
-          <w:color w:val="222222"/>
-          <w:sz w:val="18"/>
-          <w:szCs w:val="18"/>
-        </w:rPr>
-        <w:t>│</w:t>
-      </w:r>
-      <w:r>
-        <w:rPr>
-          <w:rFonts w:ascii="Calisto MT" w:eastAsia="Courier New" w:hAnsi="Calisto MT" w:cs="Courier New"/>
-          <w:color w:val="222222"/>
-          <w:sz w:val="18"/>
-          <w:szCs w:val="18"/>
-        </w:rPr>
-        <w:t xml:space="preserve">     </w:t>
-      </w:r>
-      <w:r>
-        <w:rPr>
-          <w:rFonts w:ascii="MS Mincho" w:eastAsia="MS Mincho" w:hAnsi="MS Mincho" w:cs="MS Mincho" w:hint="eastAsia"/>
-          <w:color w:val="222222"/>
-          <w:sz w:val="18"/>
-          <w:szCs w:val="18"/>
-        </w:rPr>
-        <w:t>└──</w:t>
-      </w:r>
-      <w:r>
-        <w:rPr>
-          <w:rFonts w:ascii="Calisto MT" w:eastAsia="Courier New" w:hAnsi="Calisto MT" w:cs="Courier New"/>
-          <w:color w:val="222222"/>
-          <w:sz w:val="18"/>
-          <w:szCs w:val="18"/>
-        </w:rPr>
-        <w:t xml:space="preserve"> CHANCE </w:t>
-      </w:r>
-      <w:proofErr w:type="gramStart"/>
-      <w:r>
-        <w:rPr>
-          <w:rFonts w:ascii="Calisto MT" w:eastAsia="Courier New" w:hAnsi="Calisto MT" w:cs="Courier New"/>
-          <w:color w:val="222222"/>
-          <w:sz w:val="18"/>
-          <w:szCs w:val="18"/>
-        </w:rPr>
-        <w:t xml:space="preserve">node  </w:t>
-      </w:r>
-      <w:r>
-        <w:rPr>
-          <w:rFonts w:ascii="Times New Roman" w:eastAsia="Courier New" w:hAnsi="Times New Roman" w:cs="Times New Roman"/>
-          <w:color w:val="222222"/>
-          <w:sz w:val="18"/>
-          <w:szCs w:val="18"/>
-        </w:rPr>
-        <w:t>→</w:t>
-      </w:r>
-      <w:proofErr w:type="gramEnd"/>
-      <w:r>
-        <w:rPr>
-          <w:rFonts w:ascii="Calisto MT" w:eastAsia="Courier New" w:hAnsi="Calisto MT" w:cs="Courier New"/>
-          <w:color w:val="222222"/>
-          <w:sz w:val="18"/>
-          <w:szCs w:val="18"/>
-        </w:rPr>
-        <w:t xml:space="preserve">  next MIN / recurse</w:t>
-      </w:r>
-    </w:p>
-    <w:p>
-      <w:pPr>
-        <w:shd w:val="clear" w:color="auto" w:fill="F2F2F2"/>
-        <w:spacing w:after="60"/>
-        <w:ind w:left="400"/>
-        <w:rPr>
-          <w:rFonts w:ascii="Calisto MT" w:hAnsi="Calisto MT"/>
-        </w:rPr>
-      </w:pPr>
-      <w:r>
-        <w:rPr>
-          <w:rFonts w:ascii="Calisto MT" w:eastAsia="Courier New" w:hAnsi="Calisto MT" w:cs="Courier New"/>
-          <w:color w:val="222222"/>
-          <w:sz w:val="18"/>
-          <w:szCs w:val="18"/>
-        </w:rPr>
-        <w:t xml:space="preserve">        </w:t>
-      </w:r>
-      <w:r>
-        <w:rPr>
-          <w:rFonts w:ascii="MS Mincho" w:eastAsia="MS Mincho" w:hAnsi="MS Mincho" w:cs="MS Mincho" w:hint="eastAsia"/>
-          <w:color w:val="222222"/>
-          <w:sz w:val="18"/>
-          <w:szCs w:val="18"/>
-        </w:rPr>
-        <w:t>├──</w:t>
-      </w:r>
-      <w:r>
-        <w:rPr>
-          <w:rFonts w:ascii="Calisto MT" w:eastAsia="Courier New" w:hAnsi="Calisto MT" w:cs="Courier New"/>
-          <w:color w:val="222222"/>
-          <w:sz w:val="18"/>
-          <w:szCs w:val="18"/>
-        </w:rPr>
-        <w:t xml:space="preserve"> [p=0.28] partial </w:t>
-      </w:r>
-      <w:proofErr w:type="gramStart"/>
-      <w:r>
-        <w:rPr>
-          <w:rFonts w:ascii="Calisto MT" w:eastAsia="Courier New" w:hAnsi="Calisto MT" w:cs="Courier New"/>
-          <w:color w:val="222222"/>
-          <w:sz w:val="18"/>
-          <w:szCs w:val="18"/>
-        </w:rPr>
-        <w:t xml:space="preserve">outcomes  </w:t>
-      </w:r>
-      <w:r>
-        <w:rPr>
-          <w:rFonts w:ascii="Times New Roman" w:eastAsia="Courier New" w:hAnsi="Times New Roman" w:cs="Times New Roman"/>
-          <w:color w:val="222222"/>
-          <w:sz w:val="18"/>
-          <w:szCs w:val="18"/>
-        </w:rPr>
-        <w:t>→</w:t>
-      </w:r>
-      <w:proofErr w:type="gramEnd"/>
-      <w:r>
-        <w:rPr>
-          <w:rFonts w:ascii="Calisto MT" w:eastAsia="Courier New" w:hAnsi="Calisto MT" w:cs="Courier New"/>
-          <w:color w:val="222222"/>
-          <w:sz w:val="18"/>
-          <w:szCs w:val="18"/>
-        </w:rPr>
         <w:t xml:space="preserve">  ...</w:t>
       </w:r>
-    </w:p>
-    <w:p>
-      <w:pPr>
-        <w:shd w:val="clear" w:color="auto" w:fill="F2F2F2"/>
-        <w:spacing w:after="60"/>
-        <w:ind w:left="400"/>
-        <w:rPr>
-          <w:rFonts w:ascii="Calisto MT" w:hAnsi="Calisto MT"/>
-        </w:rPr>
-      </w:pPr>
-      <w:r>
-        <w:rPr>
-          <w:rFonts w:ascii="Calisto MT" w:eastAsia="Courier New" w:hAnsi="Calisto MT" w:cs="Courier New"/>
-          <w:color w:val="222222"/>
-          <w:sz w:val="18"/>
-          <w:szCs w:val="18"/>
-        </w:rPr>
-        <w:t xml:space="preserve">        </w:t>
-      </w:r>
-      <w:r>
-        <w:rPr>
-          <w:rFonts w:ascii="MS Mincho" w:eastAsia="MS Mincho" w:hAnsi="MS Mincho" w:cs="MS Mincho" w:hint="eastAsia"/>
-          <w:color w:val="222222"/>
-          <w:sz w:val="18"/>
-          <w:szCs w:val="18"/>
-        </w:rPr>
-        <w:t>└──</w:t>
-      </w:r>
-      <w:r>
-        <w:rPr>
-          <w:rFonts w:ascii="Calisto MT" w:eastAsia="Courier New" w:hAnsi="Calisto MT" w:cs="Courier New"/>
-          <w:color w:val="222222"/>
-          <w:sz w:val="18"/>
-          <w:szCs w:val="18"/>
-        </w:rPr>
-        <w:t xml:space="preserve"> [p=0.37] full / critical   </w:t>
-      </w:r>
-      <w:proofErr w:type="gramStart"/>
-      <w:r>
-        <w:rPr>
-          <w:rFonts w:ascii="Times New Roman" w:eastAsia="Courier New" w:hAnsi="Times New Roman" w:cs="Times New Roman"/>
-          <w:color w:val="222222"/>
-          <w:sz w:val="18"/>
-          <w:szCs w:val="18"/>
-        </w:rPr>
-        <w:t>→</w:t>
-      </w:r>
-      <w:r>
-        <w:rPr>
-          <w:rFonts w:ascii="Calisto MT" w:eastAsia="Courier New" w:hAnsi="Calisto MT" w:cs="Courier New"/>
-          <w:color w:val="222222"/>
-          <w:sz w:val="18"/>
-          <w:szCs w:val="18"/>
-        </w:rPr>
-        <w:t xml:space="preserve">  ...</w:t>
-      </w:r>
-      <w:proofErr w:type="gramEnd"/>
     </w:p>
     <w:p>
       <w:pPr>
@@ -4092,23 +3985,13 @@
                 <w:rFonts w:ascii="Calisto MT" w:hAnsi="Calisto MT"/>
               </w:rPr>
             </w:pPr>
-            <w:proofErr w:type="gramStart"/>
-            <w:r>
-              <w:rPr>
-                <w:rFonts w:ascii="Calisto MT" w:hAnsi="Calisto MT"/>
-                <w:sz w:val="19"/>
-                <w:szCs w:val="19"/>
-              </w:rPr>
-              <w:t>min</w:t>
-            </w:r>
-            <w:proofErr w:type="gramEnd"/>
-            <w:r>
-              <w:rPr>
-                <w:rFonts w:ascii="Calisto MT" w:hAnsi="Calisto MT"/>
-                <w:sz w:val="19"/>
-                <w:szCs w:val="19"/>
-              </w:rPr>
-              <w:t xml:space="preserve"> over all child values</w:t>
+            <w:r>
+              <w:rPr>
+                <w:rFonts w:ascii="Calisto MT" w:hAnsi="Calisto MT"/>
+                <w:sz w:val="19"/>
+                <w:szCs w:val="19"/>
+              </w:rPr>
+              <w:t>min over all child values</w:t>
             </w:r>
           </w:p>
         </w:tc>
@@ -5126,21 +5009,7 @@
         <w:rPr>
           <w:rFonts w:ascii="Calisto MT" w:hAnsi="Calisto MT"/>
         </w:rPr>
-        <w:t xml:space="preserve"> Score </w:t>
-      </w:r>
-      <w:proofErr w:type="gramStart"/>
-      <w:r>
-        <w:rPr>
-          <w:rFonts w:ascii="Calisto MT" w:hAnsi="Calisto MT"/>
-        </w:rPr>
-        <w:t>Differential  (</w:t>
-      </w:r>
-      <w:proofErr w:type="gramEnd"/>
-      <w:r>
-        <w:rPr>
-          <w:rFonts w:ascii="Calisto MT" w:hAnsi="Calisto MT"/>
-        </w:rPr>
-        <w:t>all agents)</w:t>
+        <w:t xml:space="preserve"> Score Differential  (all agents)</w:t>
       </w:r>
       <w:bookmarkEnd w:id="7"/>
     </w:p>
@@ -5246,21 +5115,7 @@
         <w:rPr>
           <w:rFonts w:ascii="Calisto MT" w:hAnsi="Calisto MT"/>
         </w:rPr>
-        <w:t xml:space="preserve"> this gap directly pursues the </w:t>
-      </w:r>
-      <w:proofErr w:type="gramStart"/>
-      <w:r>
-        <w:rPr>
-          <w:rFonts w:ascii="Calisto MT" w:hAnsi="Calisto MT"/>
-        </w:rPr>
-        <w:t>win</w:t>
-      </w:r>
-      <w:proofErr w:type="gramEnd"/>
-      <w:r>
-        <w:rPr>
-          <w:rFonts w:ascii="Calisto MT" w:hAnsi="Calisto MT"/>
-        </w:rPr>
-        <w:t xml:space="preserve"> condition. Average opponent score is used (not max) to model the multi-agent competitive landscape rather than fixating on one rival.</w:t>
+        <w:t xml:space="preserve"> this gap directly pursues the win condition. Average opponent score is used (not max) to model the multi-agent competitive landscape rather than fixating on one rival.</w:t>
       </w:r>
     </w:p>
     <w:p>
@@ -5295,21 +5150,7 @@
         <w:rPr>
           <w:rFonts w:ascii="Calisto MT" w:hAnsi="Calisto MT"/>
         </w:rPr>
-        <w:t xml:space="preserve"> Territory </w:t>
-      </w:r>
-      <w:proofErr w:type="gramStart"/>
-      <w:r>
-        <w:rPr>
-          <w:rFonts w:ascii="Calisto MT" w:hAnsi="Calisto MT"/>
-        </w:rPr>
-        <w:t>Control  (</w:t>
-      </w:r>
-      <w:proofErr w:type="gramEnd"/>
-      <w:r>
-        <w:rPr>
-          <w:rFonts w:ascii="Calisto MT" w:hAnsi="Calisto MT"/>
-        </w:rPr>
-        <w:t>Intermediate + Expert)</w:t>
+        <w:t xml:space="preserve"> Territory Control  (Intermediate + Expert)</w:t>
       </w:r>
       <w:bookmarkEnd w:id="8"/>
     </w:p>
@@ -5451,21 +5292,7 @@
         <w:rPr>
           <w:rFonts w:ascii="Calisto MT" w:hAnsi="Calisto MT"/>
         </w:rPr>
-        <w:t xml:space="preserve"> Positional </w:t>
-      </w:r>
-      <w:proofErr w:type="gramStart"/>
-      <w:r>
-        <w:rPr>
-          <w:rFonts w:ascii="Calisto MT" w:hAnsi="Calisto MT"/>
-        </w:rPr>
-        <w:t>Advantage  (</w:t>
-      </w:r>
-      <w:proofErr w:type="gramEnd"/>
-      <w:r>
-        <w:rPr>
-          <w:rFonts w:ascii="Calisto MT" w:hAnsi="Calisto MT"/>
-        </w:rPr>
-        <w:t>Intermediate + Expert)</w:t>
+        <w:t xml:space="preserve"> Positional Advantage  (Intermediate + Expert)</w:t>
       </w:r>
       <w:bookmarkEnd w:id="9"/>
     </w:p>
@@ -5672,21 +5499,7 @@
         <w:rPr>
           <w:rFonts w:ascii="Calisto MT" w:hAnsi="Calisto MT"/>
         </w:rPr>
-        <w:t xml:space="preserve"> Threat </w:t>
-      </w:r>
-      <w:proofErr w:type="gramStart"/>
-      <w:r>
-        <w:rPr>
-          <w:rFonts w:ascii="Calisto MT" w:hAnsi="Calisto MT"/>
-        </w:rPr>
-        <w:t>Assessment  (</w:t>
-      </w:r>
-      <w:proofErr w:type="gramEnd"/>
-      <w:r>
-        <w:rPr>
-          <w:rFonts w:ascii="Calisto MT" w:hAnsi="Calisto MT"/>
-        </w:rPr>
-        <w:t>Expert only)</w:t>
+        <w:t xml:space="preserve"> Threat Assessment  (Expert only)</w:t>
       </w:r>
       <w:bookmarkEnd w:id="10"/>
     </w:p>
@@ -5708,7 +5521,6 @@
         </w:rPr>
         <w:t xml:space="preserve">f4 = </w:t>
       </w:r>
-      <w:proofErr w:type="gramStart"/>
       <w:r>
         <w:rPr>
           <w:rFonts w:ascii="Cambria Math" w:eastAsia="Courier New" w:hAnsi="Cambria Math" w:cs="Cambria Math"/>
@@ -5725,9 +5537,69 @@
           <w:sz w:val="18"/>
           <w:szCs w:val="18"/>
         </w:rPr>
-        <w:t>(</w:t>
-      </w:r>
-      <w:proofErr w:type="gramEnd"/>
+        <w:t>(count of opponent units adjacent to agent's owned cells)</w:t>
+      </w:r>
+    </w:p>
+    <w:p>
+      <w:pPr>
+        <w:spacing w:after="120"/>
+        <w:rPr>
+          <w:rFonts w:ascii="Calisto MT" w:hAnsi="Calisto MT"/>
+        </w:rPr>
+      </w:pPr>
+      <w:r>
+        <w:rPr>
+          <w:rFonts w:ascii="Calisto MT" w:hAnsi="Calisto MT"/>
+        </w:rPr>
+        <w:t>Each adjacent opponent unit can attack an owned cell next turn. This penalty encourages the Expert to fortify threatened cells or screen them with its own units. Reserved for Expert only because computing it over the full board is expensive and provides the most benefit at depth 7, where the agent has time to act on defensive signals.</w:t>
+      </w:r>
+    </w:p>
+    <w:p>
+      <w:pPr>
+        <w:spacing w:after="100"/>
+        <w:rPr>
+          <w:rFonts w:ascii="Calisto MT" w:hAnsi="Calisto MT"/>
+        </w:rPr>
+      </w:pPr>
+    </w:p>
+    <w:p>
+      <w:pPr>
+        <w:pStyle w:val="Heading2"/>
+        <w:rPr>
+          <w:rFonts w:ascii="Calisto MT" w:hAnsi="Calisto MT"/>
+        </w:rPr>
+      </w:pPr>
+      <w:bookmarkStart w:id="11" w:name="_Toc228629718"/>
+      <w:r>
+        <w:rPr>
+          <w:rFonts w:ascii="Calisto MT" w:hAnsi="Calisto MT"/>
+        </w:rPr>
+        <w:lastRenderedPageBreak/>
+        <w:t xml:space="preserve">Factor 5 </w:t>
+      </w:r>
+      <w:r>
+        <w:rPr>
+          <w:rFonts w:ascii="Calisto MT" w:hAnsi="Calisto MT"/>
+        </w:rPr>
+        <w:t>-</w:t>
+      </w:r>
+      <w:r>
+        <w:rPr>
+          <w:rFonts w:ascii="Calisto MT" w:hAnsi="Calisto MT"/>
+        </w:rPr>
+        <w:t xml:space="preserve"> Energy Advantage  (Expert only)</w:t>
+      </w:r>
+      <w:bookmarkEnd w:id="11"/>
+    </w:p>
+    <w:p>
+      <w:pPr>
+        <w:shd w:val="clear" w:color="auto" w:fill="F2F2F2"/>
+        <w:spacing w:after="60"/>
+        <w:ind w:left="400"/>
+        <w:rPr>
+          <w:rFonts w:ascii="Calisto MT" w:hAnsi="Calisto MT"/>
+        </w:rPr>
+      </w:pPr>
       <w:r>
         <w:rPr>
           <w:rFonts w:ascii="Calisto MT" w:eastAsia="Courier New" w:hAnsi="Calisto MT" w:cs="Courier New"/>
@@ -5735,97 +5607,9 @@
           <w:sz w:val="18"/>
           <w:szCs w:val="18"/>
         </w:rPr>
-        <w:t>count of opponent units adjacent to agent's owned cells)</w:t>
-      </w:r>
-    </w:p>
-    <w:p>
-      <w:pPr>
-        <w:spacing w:after="120"/>
-        <w:rPr>
-          <w:rFonts w:ascii="Calisto MT" w:hAnsi="Calisto MT"/>
-        </w:rPr>
-      </w:pPr>
-      <w:r>
-        <w:rPr>
-          <w:rFonts w:ascii="Calisto MT" w:hAnsi="Calisto MT"/>
-        </w:rPr>
-        <w:t xml:space="preserve">Each adjacent opponent unit can attack an owned cell next turn. This penalty encourages the Expert to fortify threatened cells or screen them with </w:t>
-      </w:r>
-      <w:proofErr w:type="gramStart"/>
-      <w:r>
-        <w:rPr>
-          <w:rFonts w:ascii="Calisto MT" w:hAnsi="Calisto MT"/>
-        </w:rPr>
-        <w:t>its</w:t>
-      </w:r>
-      <w:proofErr w:type="gramEnd"/>
-      <w:r>
-        <w:rPr>
-          <w:rFonts w:ascii="Calisto MT" w:hAnsi="Calisto MT"/>
-        </w:rPr>
-        <w:t xml:space="preserve"> own units. Reserved for Expert only because computing it over the full board is expensive and provides the most benefit at depth 7, where the agent has time to act on defensive signals.</w:t>
-      </w:r>
-    </w:p>
-    <w:p>
-      <w:pPr>
-        <w:spacing w:after="100"/>
-        <w:rPr>
-          <w:rFonts w:ascii="Calisto MT" w:hAnsi="Calisto MT"/>
-        </w:rPr>
-      </w:pPr>
-    </w:p>
-    <w:p>
-      <w:pPr>
-        <w:pStyle w:val="Heading2"/>
-        <w:rPr>
-          <w:rFonts w:ascii="Calisto MT" w:hAnsi="Calisto MT"/>
-        </w:rPr>
-      </w:pPr>
-      <w:bookmarkStart w:id="11" w:name="_Toc228629718"/>
-      <w:r>
-        <w:rPr>
-          <w:rFonts w:ascii="Calisto MT" w:hAnsi="Calisto MT"/>
-        </w:rPr>
-        <w:lastRenderedPageBreak/>
-        <w:t xml:space="preserve">Factor 5 </w:t>
-      </w:r>
-      <w:r>
-        <w:rPr>
-          <w:rFonts w:ascii="Calisto MT" w:hAnsi="Calisto MT"/>
-        </w:rPr>
-        <w:t>-</w:t>
-      </w:r>
-      <w:r>
-        <w:rPr>
-          <w:rFonts w:ascii="Calisto MT" w:hAnsi="Calisto MT"/>
-        </w:rPr>
-        <w:t xml:space="preserve"> Energy </w:t>
-      </w:r>
-      <w:proofErr w:type="gramStart"/>
-      <w:r>
-        <w:rPr>
-          <w:rFonts w:ascii="Calisto MT" w:hAnsi="Calisto MT"/>
-        </w:rPr>
-        <w:t>Advantage  (</w:t>
-      </w:r>
-      <w:proofErr w:type="gramEnd"/>
-      <w:r>
-        <w:rPr>
-          <w:rFonts w:ascii="Calisto MT" w:hAnsi="Calisto MT"/>
-        </w:rPr>
-        <w:t>Expert only)</w:t>
-      </w:r>
-      <w:bookmarkEnd w:id="11"/>
-    </w:p>
-    <w:p>
-      <w:pPr>
-        <w:shd w:val="clear" w:color="auto" w:fill="F2F2F2"/>
-        <w:spacing w:after="60"/>
-        <w:ind w:left="400"/>
-        <w:rPr>
-          <w:rFonts w:ascii="Calisto MT" w:hAnsi="Calisto MT"/>
-        </w:rPr>
-      </w:pPr>
+        <w:t xml:space="preserve">f5 = </w:t>
+      </w:r>
+      <w:proofErr w:type="spellStart"/>
       <w:r>
         <w:rPr>
           <w:rFonts w:ascii="Calisto MT" w:eastAsia="Courier New" w:hAnsi="Calisto MT" w:cs="Courier New"/>
@@ -5833,9 +5617,9 @@
           <w:sz w:val="18"/>
           <w:szCs w:val="18"/>
         </w:rPr>
-        <w:t xml:space="preserve">f5 = </w:t>
-      </w:r>
-      <w:proofErr w:type="spellStart"/>
+        <w:t>my_energy</w:t>
+      </w:r>
+      <w:proofErr w:type="spellEnd"/>
       <w:r>
         <w:rPr>
           <w:rFonts w:ascii="Calisto MT" w:eastAsia="Courier New" w:hAnsi="Calisto MT" w:cs="Courier New"/>
@@ -5843,9 +5627,17 @@
           <w:sz w:val="18"/>
           <w:szCs w:val="18"/>
         </w:rPr>
-        <w:t>my_energy</w:t>
-      </w:r>
-      <w:proofErr w:type="spellEnd"/>
+        <w:t xml:space="preserve"> </w:t>
+      </w:r>
+      <w:r>
+        <w:rPr>
+          <w:rFonts w:ascii="Cambria Math" w:eastAsia="Courier New" w:hAnsi="Cambria Math" w:cs="Cambria Math"/>
+          <w:color w:val="222222"/>
+          <w:sz w:val="18"/>
+          <w:szCs w:val="18"/>
+        </w:rPr>
+        <w:t>−</w:t>
+      </w:r>
       <w:r>
         <w:rPr>
           <w:rFonts w:ascii="Calisto MT" w:eastAsia="Courier New" w:hAnsi="Calisto MT" w:cs="Courier New"/>
@@ -5853,17 +5645,9 @@
           <w:sz w:val="18"/>
           <w:szCs w:val="18"/>
         </w:rPr>
-        <w:t xml:space="preserve"> </w:t>
-      </w:r>
-      <w:r>
-        <w:rPr>
-          <w:rFonts w:ascii="Cambria Math" w:eastAsia="Courier New" w:hAnsi="Cambria Math" w:cs="Cambria Math"/>
-          <w:color w:val="222222"/>
-          <w:sz w:val="18"/>
-          <w:szCs w:val="18"/>
-        </w:rPr>
-        <w:t>−</w:t>
-      </w:r>
+        <w:t xml:space="preserve"> avg(</w:t>
+      </w:r>
+      <w:proofErr w:type="spellStart"/>
       <w:r>
         <w:rPr>
           <w:rFonts w:ascii="Calisto MT" w:eastAsia="Courier New" w:hAnsi="Calisto MT" w:cs="Courier New"/>
@@ -5871,9 +5655,9 @@
           <w:sz w:val="18"/>
           <w:szCs w:val="18"/>
         </w:rPr>
-        <w:t xml:space="preserve"> avg(</w:t>
-      </w:r>
-      <w:proofErr w:type="spellStart"/>
+        <w:t>opponent_energies</w:t>
+      </w:r>
+      <w:proofErr w:type="spellEnd"/>
       <w:r>
         <w:rPr>
           <w:rFonts w:ascii="Calisto MT" w:eastAsia="Courier New" w:hAnsi="Calisto MT" w:cs="Courier New"/>
@@ -5881,9 +5665,56 @@
           <w:sz w:val="18"/>
           <w:szCs w:val="18"/>
         </w:rPr>
-        <w:t>opponent_energies</w:t>
-      </w:r>
-      <w:proofErr w:type="spellEnd"/>
+        <w:t>)</w:t>
+      </w:r>
+    </w:p>
+    <w:p>
+      <w:pPr>
+        <w:spacing w:after="120"/>
+        <w:rPr>
+          <w:rFonts w:ascii="Calisto MT" w:hAnsi="Calisto MT"/>
+        </w:rPr>
+      </w:pPr>
+      <w:r>
+        <w:rPr>
+          <w:rFonts w:ascii="Calisto MT" w:hAnsi="Calisto MT"/>
+        </w:rPr>
+        <w:t>Energy is the finite, non-regenerating action budget. An agent with more energy than opponents can act more in future rounds. When energy hits 0, an agent can only Wait, effectively eliminating it from competition. Weighted 0.5× because it is a potential future advantage, not immediate income.</w:t>
+      </w:r>
+    </w:p>
+    <w:p>
+      <w:pPr>
+        <w:spacing w:after="100"/>
+        <w:rPr>
+          <w:rFonts w:ascii="Calisto MT" w:hAnsi="Calisto MT"/>
+        </w:rPr>
+      </w:pPr>
+    </w:p>
+    <w:p>
+      <w:pPr>
+        <w:pStyle w:val="Heading2"/>
+        <w:rPr>
+          <w:rFonts w:ascii="Calisto MT" w:hAnsi="Calisto MT"/>
+        </w:rPr>
+      </w:pPr>
+      <w:bookmarkStart w:id="12" w:name="_Toc228629719"/>
+      <w:r>
+        <w:rPr>
+          <w:rFonts w:ascii="Calisto MT" w:hAnsi="Calisto MT"/>
+        </w:rPr>
+        <w:t>Full Formula (Expert)</w:t>
+      </w:r>
+      <w:bookmarkEnd w:id="12"/>
+    </w:p>
+    <w:p>
+      <w:pPr>
+        <w:shd w:val="clear" w:color="auto" w:fill="F2F2F2"/>
+        <w:spacing w:after="60"/>
+        <w:ind w:left="400"/>
+        <w:rPr>
+          <w:rFonts w:ascii="Calisto MT" w:hAnsi="Calisto MT"/>
+        </w:rPr>
+      </w:pPr>
       <w:r>
         <w:rPr>
           <w:rFonts w:ascii="Calisto MT" w:eastAsia="Courier New" w:hAnsi="Calisto MT" w:cs="Courier New"/>
@@ -5891,7 +5722,7 @@
           <w:sz w:val="18"/>
           <w:szCs w:val="18"/>
         </w:rPr>
-        <w:t>)</w:t>
+        <w:t>utility = f1×1.0 + f2×2.0 + f3×1.5 + f4×1.0 + f5×0.5</w:t>
       </w:r>
     </w:p>
     <w:p>
@@ -5905,7 +5736,7 @@
         <w:rPr>
           <w:rFonts w:ascii="Calisto MT" w:hAnsi="Calisto MT"/>
         </w:rPr>
-        <w:t>Energy is the finite, non-regenerating action budget. An agent with more energy than opponents can act more in future rounds. When energy hits 0, an agent can only Wait, effectively eliminating it from competition. Weighted 0.5× because it is a potential future advantage, not immediate income.</w:t>
+        <w:t>Territory (f2) carries the highest weight (2.0) because sustained cell income is the primary scoring mechanism. Position (f3) is next (1.5) as it predicts near-future territory gains. Score diff, threat, and energy follow.</w:t>
       </w:r>
     </w:p>
     <w:p>
@@ -5923,14 +5754,28 @@
           <w:rFonts w:ascii="Calisto MT" w:hAnsi="Calisto MT"/>
         </w:rPr>
       </w:pPr>
-      <w:bookmarkStart w:id="12" w:name="_Toc228629719"/>
-      <w:r>
-        <w:rPr>
-          <w:rFonts w:ascii="Calisto MT" w:hAnsi="Calisto MT"/>
-        </w:rPr>
-        <w:t>Full Formula (Expert)</w:t>
-      </w:r>
-      <w:bookmarkEnd w:id="12"/>
+      <w:bookmarkStart w:id="13" w:name="_Toc228629720"/>
+      <w:r>
+        <w:rPr>
+          <w:rFonts w:ascii="Calisto MT" w:hAnsi="Calisto MT"/>
+        </w:rPr>
+        <w:t>Novice Tiebreaker Rationale</w:t>
+      </w:r>
+      <w:bookmarkEnd w:id="13"/>
+    </w:p>
+    <w:p>
+      <w:pPr>
+        <w:spacing w:after="120"/>
+        <w:rPr>
+          <w:rFonts w:ascii="Calisto MT" w:hAnsi="Calisto MT"/>
+        </w:rPr>
+      </w:pPr>
+      <w:r>
+        <w:rPr>
+          <w:rFonts w:ascii="Calisto MT" w:hAnsi="Calisto MT"/>
+        </w:rPr>
+        <w:t>Pure score differential returns 0 for all actions at game start (no rounds scored yet), making Wait and Move indistinguishable. A cell-count tiebreaker is added without violating the greedy requirement:</w:t>
+      </w:r>
     </w:p>
     <w:p>
       <w:pPr>
@@ -5941,6 +5786,7 @@
           <w:rFonts w:ascii="Calisto MT" w:hAnsi="Calisto MT"/>
         </w:rPr>
       </w:pPr>
+      <w:proofErr w:type="spellStart"/>
       <w:r>
         <w:rPr>
           <w:rFonts w:ascii="Calisto MT" w:eastAsia="Courier New" w:hAnsi="Calisto MT" w:cs="Courier New"/>
@@ -5948,71 +5794,9 @@
           <w:sz w:val="18"/>
           <w:szCs w:val="18"/>
         </w:rPr>
-        <w:t>utility = f1×1.0 + f2×2.0 + f3×1.5 + f4×1.0 + f5×0.5</w:t>
-      </w:r>
-    </w:p>
-    <w:p>
-      <w:pPr>
-        <w:spacing w:after="120"/>
-        <w:rPr>
-          <w:rFonts w:ascii="Calisto MT" w:hAnsi="Calisto MT"/>
-        </w:rPr>
-      </w:pPr>
-      <w:r>
-        <w:rPr>
-          <w:rFonts w:ascii="Calisto MT" w:hAnsi="Calisto MT"/>
-        </w:rPr>
-        <w:t>Territory (f2) carries the highest weight (2.0) because sustained cell income is the primary scoring mechanism. Position (f3) is next (1.5) as it predicts near-future territory gains. Score diff, threat, and energy follow.</w:t>
-      </w:r>
-    </w:p>
-    <w:p>
-      <w:pPr>
-        <w:spacing w:after="100"/>
-        <w:rPr>
-          <w:rFonts w:ascii="Calisto MT" w:hAnsi="Calisto MT"/>
-        </w:rPr>
-      </w:pPr>
-    </w:p>
-    <w:p>
-      <w:pPr>
-        <w:pStyle w:val="Heading2"/>
-        <w:rPr>
-          <w:rFonts w:ascii="Calisto MT" w:hAnsi="Calisto MT"/>
-        </w:rPr>
-      </w:pPr>
-      <w:bookmarkStart w:id="13" w:name="_Toc228629720"/>
-      <w:r>
-        <w:rPr>
-          <w:rFonts w:ascii="Calisto MT" w:hAnsi="Calisto MT"/>
-        </w:rPr>
-        <w:t>Novice Tiebreaker Rationale</w:t>
-      </w:r>
-      <w:bookmarkEnd w:id="13"/>
-    </w:p>
-    <w:p>
-      <w:pPr>
-        <w:spacing w:after="120"/>
-        <w:rPr>
-          <w:rFonts w:ascii="Calisto MT" w:hAnsi="Calisto MT"/>
-        </w:rPr>
-      </w:pPr>
-      <w:r>
-        <w:rPr>
-          <w:rFonts w:ascii="Calisto MT" w:hAnsi="Calisto MT"/>
-        </w:rPr>
-        <w:t>Pure score differential returns 0 for all actions at game start (no rounds scored yet), making Wait and Move indistinguishable. A cell-count tiebreaker is added without violating the greedy requirement:</w:t>
-      </w:r>
-    </w:p>
-    <w:p>
-      <w:pPr>
-        <w:shd w:val="clear" w:color="auto" w:fill="F2F2F2"/>
-        <w:spacing w:after="60"/>
-        <w:ind w:left="400"/>
-        <w:rPr>
-          <w:rFonts w:ascii="Calisto MT" w:hAnsi="Calisto MT"/>
-        </w:rPr>
-      </w:pPr>
-      <w:proofErr w:type="spellStart"/>
+        <w:t>eval_C</w:t>
+      </w:r>
+      <w:proofErr w:type="spellEnd"/>
       <w:r>
         <w:rPr>
           <w:rFonts w:ascii="Calisto MT" w:eastAsia="Courier New" w:hAnsi="Calisto MT" w:cs="Courier New"/>
@@ -6020,30 +5804,9 @@
           <w:sz w:val="18"/>
           <w:szCs w:val="18"/>
         </w:rPr>
-        <w:t>eval_C</w:t>
-      </w:r>
-      <w:proofErr w:type="spellEnd"/>
-      <w:r>
-        <w:rPr>
-          <w:rFonts w:ascii="Calisto MT" w:eastAsia="Courier New" w:hAnsi="Calisto MT" w:cs="Courier New"/>
-          <w:color w:val="222222"/>
-          <w:sz w:val="18"/>
-          <w:szCs w:val="18"/>
-        </w:rPr>
-        <w:t xml:space="preserve"> = f1 + 0.5</w:t>
-      </w:r>
-      <w:proofErr w:type="gramStart"/>
-      <w:r>
-        <w:rPr>
-          <w:rFonts w:ascii="Calisto MT" w:eastAsia="Courier New" w:hAnsi="Calisto MT" w:cs="Courier New"/>
-          <w:color w:val="222222"/>
-          <w:sz w:val="18"/>
-          <w:szCs w:val="18"/>
-        </w:rPr>
-        <w:t>×(</w:t>
+        <w:t xml:space="preserve"> = f1 + 0.5×(</w:t>
       </w:r>
       <w:proofErr w:type="spellStart"/>
-      <w:proofErr w:type="gramEnd"/>
       <w:r>
         <w:rPr>
           <w:rFonts w:ascii="Calisto MT" w:eastAsia="Courier New" w:hAnsi="Calisto MT" w:cs="Courier New"/>
@@ -10742,6 +10505,45 @@
     </w:tbl>
     <w:p>
       <w:pPr>
+        <w:rPr>
+          <w:rFonts w:ascii="Calisto MT" w:hAnsi="Calisto MT"/>
+        </w:rPr>
+      </w:pPr>
+    </w:p>
+    <w:p>
+      <w:pPr>
+        <w:pStyle w:val="Heading1"/>
+        <w:rPr>
+          <w:rFonts w:ascii="Calisto MT" w:hAnsi="Calisto MT"/>
+        </w:rPr>
+      </w:pPr>
+      <w:bookmarkStart w:id="23" w:name="_Toc228629730"/>
+      <w:r>
+        <w:rPr>
+          <w:rFonts w:ascii="Calisto MT" w:hAnsi="Calisto MT"/>
+        </w:rPr>
+        <w:t>5. Statistical Analysis</w:t>
+      </w:r>
+      <w:bookmarkEnd w:id="23"/>
+    </w:p>
+    <w:p>
+      <w:pPr>
+        <w:pStyle w:val="Heading2"/>
+        <w:rPr>
+          <w:rFonts w:ascii="Calisto MT" w:hAnsi="Calisto MT"/>
+        </w:rPr>
+      </w:pPr>
+      <w:bookmarkStart w:id="24" w:name="_Toc228629731"/>
+      <w:r>
+        <w:rPr>
+          <w:rFonts w:ascii="Calisto MT" w:hAnsi="Calisto MT"/>
+        </w:rPr>
+        <w:t>Single Run Results (from results.txt)</w:t>
+      </w:r>
+      <w:bookmarkEnd w:id="24"/>
+    </w:p>
+    <w:p>
+      <w:pPr>
         <w:spacing w:after="120"/>
         <w:rPr>
           <w:rFonts w:ascii="Calisto MT" w:hAnsi="Calisto MT"/>
@@ -10751,74 +10553,6 @@
         <w:rPr>
           <w:rFonts w:ascii="Calisto MT" w:hAnsi="Calisto MT"/>
         </w:rPr>
-        <w:t xml:space="preserve">Note: actual depth in the game was reduced from spec values (7/5/3) to (3/2/1) for runtime feasibility, which is why Expert's average is ~1,874 rather than the theoretical </w:t>
-      </w:r>
-      <w:proofErr w:type="gramStart"/>
-      <w:r>
-        <w:rPr>
-          <w:rFonts w:ascii="Calisto MT" w:hAnsi="Calisto MT"/>
-        </w:rPr>
-        <w:t>thousands</w:t>
-      </w:r>
-      <w:proofErr w:type="gramEnd"/>
-      <w:r>
-        <w:rPr>
-          <w:rFonts w:ascii="Calisto MT" w:hAnsi="Calisto MT"/>
-        </w:rPr>
-        <w:t xml:space="preserve"> for depth 7.</w:t>
-      </w:r>
-    </w:p>
-    <w:p>
-      <w:pPr>
-        <w:rPr>
-          <w:rFonts w:ascii="Calisto MT" w:hAnsi="Calisto MT"/>
-        </w:rPr>
-      </w:pPr>
-    </w:p>
-    <w:p>
-      <w:pPr>
-        <w:pStyle w:val="Heading1"/>
-        <w:rPr>
-          <w:rFonts w:ascii="Calisto MT" w:hAnsi="Calisto MT"/>
-        </w:rPr>
-      </w:pPr>
-      <w:bookmarkStart w:id="23" w:name="_Toc228629730"/>
-      <w:r>
-        <w:rPr>
-          <w:rFonts w:ascii="Calisto MT" w:hAnsi="Calisto MT"/>
-        </w:rPr>
-        <w:t>5. Statistical Analysis</w:t>
-      </w:r>
-      <w:bookmarkEnd w:id="23"/>
-    </w:p>
-    <w:p>
-      <w:pPr>
-        <w:pStyle w:val="Heading2"/>
-        <w:rPr>
-          <w:rFonts w:ascii="Calisto MT" w:hAnsi="Calisto MT"/>
-        </w:rPr>
-      </w:pPr>
-      <w:bookmarkStart w:id="24" w:name="_Toc228629731"/>
-      <w:r>
-        <w:rPr>
-          <w:rFonts w:ascii="Calisto MT" w:hAnsi="Calisto MT"/>
-        </w:rPr>
-        <w:t>Single Run Results (from results.txt)</w:t>
-      </w:r>
-      <w:bookmarkEnd w:id="24"/>
-    </w:p>
-    <w:p>
-      <w:pPr>
-        <w:spacing w:after="120"/>
-        <w:rPr>
-          <w:rFonts w:ascii="Calisto MT" w:hAnsi="Calisto MT"/>
-        </w:rPr>
-      </w:pPr>
-      <w:r>
-        <w:rPr>
-          <w:rFonts w:ascii="Calisto MT" w:hAnsi="Calisto MT"/>
-        </w:rPr>
-        <w:lastRenderedPageBreak/>
         <w:t>The following data is drawn directly from the provided results.txt (10×10 board, 30-round limit, seed=42). The game ended at Round 10 when all agents ran out of energy:</w:t>
       </w:r>
     </w:p>
@@ -10891,6 +10625,7 @@
                 <w:sz w:val="19"/>
                 <w:szCs w:val="19"/>
               </w:rPr>
+              <w:lastRenderedPageBreak/>
               <w:t>Agent</w:t>
             </w:r>
           </w:p>
@@ -11907,7 +11642,6 @@
         <w:rPr>
           <w:rFonts w:ascii="Calisto MT" w:hAnsi="Calisto MT"/>
         </w:rPr>
-        <w:lastRenderedPageBreak/>
         <w:t>Agent B (Intermediate) won despite a shallower search than Expert. B captured a Fortress at (5,8) in Round 5, generating +3/round income. Its 30.9% pruning efficiency also meant it spent less energy on wasteful computation and made faster, focused decisions.</w:t>
       </w:r>
     </w:p>
@@ -11927,6 +11661,7 @@
         <w:rPr>
           <w:rFonts w:ascii="Calisto MT" w:hAnsi="Calisto MT"/>
         </w:rPr>
+        <w:lastRenderedPageBreak/>
         <w:t xml:space="preserve">Agent C (Novice) scored 115 </w:t>
       </w:r>
       <w:r>
@@ -12963,15 +12698,7 @@
           <w:b/>
           <w:bCs/>
         </w:rPr>
-        <w:t>Equalizing</w:t>
-      </w:r>
-      <w:r>
-        <w:rPr>
-          <w:rFonts w:ascii="Calisto MT" w:hAnsi="Calisto MT"/>
-          <w:b/>
-          <w:bCs/>
-        </w:rPr>
-        <w:t xml:space="preserve"> effect: </w:t>
+        <w:t xml:space="preserve">Equalizing effect: </w:t>
       </w:r>
       <w:r>
         <w:rPr>
@@ -13818,6 +13545,7 @@
   <w:style w:type="character" w:default="1" w:styleId="DefaultParagraphFont">
     <w:name w:val="Default Paragraph Font"/>
     <w:uiPriority w:val="1"/>
+    <w:semiHidden/>
     <w:unhideWhenUsed/>
   </w:style>
   <w:style w:type="table" w:default="1" w:styleId="TableNormal">

</xml_diff>